<commit_message>
Add GitHub repository link to documentation and evidence report
</commit_message>
<xml_diff>
--- a/ACTIVITY9_EVIDENCE_REPORT.docx
+++ b/ACTIVITY9_EVIDENCE_REPORT.docx
@@ -1078,7 +1078,7 @@
           <w:i w:val="0"/>
           <w:sz w:val="21"/>
         </w:rPr>
-        <w:t>Checkpoint 1 (Activity 8): Initial Flutter Web project - home/login/navigation shell</w:t>
+        <w:t>Checkpoint 1 (Activity 8): c7497c3 - Initial Flutter Web project - home/login/navigation shell</w:t>
       </w:r>
     </w:p>
     <w:p>
@@ -1088,7 +1088,17 @@
           <w:i w:val="0"/>
           <w:sz w:val="21"/>
         </w:rPr>
-        <w:t>Checkpoint 2 (Activity 9): Add report form and Flutter UI states</w:t>
+        <w:t>Checkpoint 2 (Activity 9): 1a14bf0 - Update group member to andymarkcrasco</w:t>
+      </w:r>
+    </w:p>
+    <w:p>
+      <w:r>
+        <w:rPr>
+          <w:b w:val="0"/>
+          <w:i w:val="0"/>
+          <w:sz w:val="21"/>
+        </w:rPr>
+        <w:t>Checkpoint 3 (Activity 9): 1ef6ac3 - Add report form and Flutter UI states</w:t>
       </w:r>
     </w:p>
     <w:p>
@@ -1098,7 +1108,7 @@
           <w:i w:val="0"/>
           <w:sz w:val="21"/>
         </w:rPr>
-        <w:t>GitHub repository link: _TODO: paste the repository link here before submission_</w:t>
+        <w:t>GitHub repository link: https://github.com/andymarkcrasco-blip/activity8</w:t>
       </w:r>
     </w:p>
     <w:p>

</xml_diff>

<commit_message>
Add post-laboratory reflection answers to evidence report
</commit_message>
<xml_diff>
--- a/ACTIVITY9_EVIDENCE_REPORT.docx
+++ b/ACTIVITY9_EVIDENCE_REPORT.docx
@@ -1154,6 +1154,117 @@
         <w:t>No report record is actually saved in a database in this activity - the saved list is kept in memory for the running session.</w:t>
       </w:r>
     </w:p>
+    <w:p>
+      <w:pPr>
+        <w:pStyle w:val="Heading1"/>
+      </w:pPr>
+      <w:r>
+        <w:rPr>
+          <w:color w:val="3F2780"/>
+        </w:rPr>
+        <w:t>9. Post-Laboratory Reflection</w:t>
+      </w:r>
+    </w:p>
+    <w:p>
+      <w:r>
+        <w:rPr>
+          <w:b w:val="0"/>
+          <w:i w:val="0"/>
+          <w:sz w:val="21"/>
+        </w:rPr>
+        <w:t>1. How does report_form_screen.dart extend your Activity 8 project without replacing its existing Home and Login screens?</w:t>
+      </w:r>
+    </w:p>
+    <w:p>
+      <w:r>
+        <w:rPr>
+          <w:b w:val="0"/>
+          <w:i w:val="0"/>
+          <w:sz w:val="21"/>
+        </w:rPr>
+        <w:t>report_form_screen.dart was added as a new file under lib/screens/ and registered as a new '/report' route in the existing go_router configuration (lib/routes/app_routes.dart). The Activity 8 Home, Login and Dashboard screens were only given an extra navigation button; their original code and behavior were not replaced. The folder structure from Activity 8 (screens, widgets, routes, services, models, constants) is preserved, so the new screen simply reuses the same shared components instead of duplicating interface code.</w:t>
+      </w:r>
+    </w:p>
+    <w:p>
+      <w:r>
+        <w:rPr>
+          <w:b w:val="0"/>
+          <w:i w:val="0"/>
+          <w:sz w:val="21"/>
+        </w:rPr>
+        <w:t>2. Which shared widget did your group reuse, and what benefit does that provide?</w:t>
+      </w:r>
+    </w:p>
+    <w:p>
+      <w:r>
+        <w:rPr>
+          <w:b w:val="0"/>
+          <w:i w:val="0"/>
+          <w:sz w:val="21"/>
+        </w:rPr>
+        <w:t>The group reused AppTextField from lib/widgets/app_text_field.dart in two different screens - the Description field of report_form_screen.dart (line 200) and the Username field of login_screen.dart (line 63) - and AppButton in four screens (home, login, dashboard and report form). The benefit is the 'build once, reuse many times' principle: the label style, borders, validation hooks and button behavior stay consistent across the whole application, any change to the component automatically updates every screen that uses it, there is much less duplicated code, and each team member can work on a different layer without conflicting edits.</w:t>
+      </w:r>
+    </w:p>
+    <w:p>
+      <w:r>
+        <w:rPr>
+          <w:b w:val="0"/>
+          <w:i w:val="0"/>
+          <w:sz w:val="21"/>
+        </w:rPr>
+        <w:t>3. How does your report form prevent invalid input and duplicate submissions?</w:t>
+      </w:r>
+    </w:p>
+    <w:p>
+      <w:r>
+        <w:rPr>
+          <w:b w:val="0"/>
+          <w:i w:val="0"/>
+          <w:sz w:val="21"/>
+        </w:rPr>
+        <w:t>Invalid input is prevented by a GlobalKey&lt;FormState&gt; and per-field validators: the report title needs at least 5 characters, the description at least 10 characters, the category and the location are required dropdowns, and an optional contact number must be at least 7 digits. Duplicate submission is prevented in two ways: the submitReport() method returns immediately while the state is LOADING, and the shared AppButton is given isLoading: true so it is rendered disabled with a spinner while the simulated request is still pending.</w:t>
+      </w:r>
+    </w:p>
+    <w:p>
+      <w:r>
+        <w:rPr>
+          <w:b w:val="0"/>
+          <w:i w:val="0"/>
+          <w:sz w:val="21"/>
+        </w:rPr>
+        <w:t>4. How did you reproduce the Loading, Success, Empty, and Error responses? Which were simulated?</w:t>
+      </w:r>
+    </w:p>
+    <w:p>
+      <w:r>
+        <w:rPr>
+          <w:b w:val="0"/>
+          <w:i w:val="0"/>
+          <w:sz w:val="21"/>
+        </w:rPr>
+        <w:t>LOADING was reproduced by submitting a valid form and capturing the screen while the asynchronous request was still pending (the button was disabled with a spinner). SUCCESS was reproduced by letting the request finish without an error, which returned the green confirmation with the report reference number. EMPTY was reproduced by opening the Report Form before any report record existed, showing the 'EMPTY - No report records' response and 'Submitted Reports (0)'. ERROR was reproduced by turning on the 'Simulate API failure (demo only)' switch and submitting, which produced the red failure explanation and the Retry button. ALL FOUR responses are currently SIMULATED using Future.delayed, because the REST API and the PostgreSQL database are not connected yet.</w:t>
+      </w:r>
+    </w:p>
+    <w:p>
+      <w:r>
+        <w:rPr>
+          <w:b w:val="0"/>
+          <w:i w:val="0"/>
+          <w:sz w:val="21"/>
+        </w:rPr>
+        <w:t>5. What must be changed when the real REST API and PostgreSQL database are connected later?</w:t>
+      </w:r>
+    </w:p>
+    <w:p>
+      <w:r>
+        <w:rPr>
+          <w:b w:val="0"/>
+          <w:i w:val="0"/>
+          <w:sz w:val="21"/>
+        </w:rPr>
+        <w:t>Only lib/services/report_service.dart has to change: the Future.delayed block is replaced with an http.post call to the instructor-approved REST API (e.g. FastAPI), the JSON response is mapped into the ReportModel, and the screen loads the report list from the API so that the EMPTY state is produced by a real query instead of an empty in-memory list. The ReportUiState enum, the AppStateView widget and all four state builders in report_form_screen.dart stay exactly the same, so the LOADING, SUCCESS, EMPTY and ERROR responses keep working with real data; the 'Simulate API failure' switch can then be removed because genuine server errors will be handled by the same catch block.</w:t>
+      </w:r>
+    </w:p>
     <w:sectPr>
       <w:pgSz w:w="12240" w:h="15840"/>
       <w:pgMar w:top="864" w:right="1008" w:bottom="864" w:left="1008" w:header="720" w:footer="720" w:gutter="0"/>

</xml_diff>

<commit_message>
Rewrite evidence report in the group's own voice
</commit_message>
<xml_diff>
--- a/ACTIVITY9_EVIDENCE_REPORT.docx
+++ b/ACTIVITY9_EVIDENCE_REPORT.docx
@@ -8,37 +8,40 @@
         <w:jc w:val="center"/>
       </w:pPr>
       <w:r>
-        <w:t>Laboratory Manual Activity No. 9</w:t>
+        <w:t>Laboratory Activity No. 9</w:t>
       </w:r>
     </w:p>
     <w:p>
       <w:pPr>
+        <w:spacing w:after="120"/>
         <w:jc w:val="center"/>
       </w:pPr>
       <w:r>
         <w:rPr>
           <w:b/>
           <w:i w:val="0"/>
-          <w:sz w:val="26"/>
+          <w:sz w:val="25"/>
         </w:rPr>
         <w:t>Continuing the Flutter Web Project with a Report Form and UI State Responses</w:t>
       </w:r>
     </w:p>
     <w:p>
       <w:pPr>
+        <w:spacing w:after="120"/>
         <w:jc w:val="center"/>
       </w:pPr>
       <w:r>
         <w:rPr>
           <w:b w:val="0"/>
           <w:i/>
-          <w:sz w:val="22"/>
+          <w:sz w:val="21"/>
         </w:rPr>
         <w:t>Reusable Screen and Widget Structure | Loading, Success, Empty, and Error States</w:t>
       </w:r>
     </w:p>
     <w:p>
       <w:pPr>
+        <w:spacing w:after="120"/>
         <w:jc w:val="center"/>
       </w:pPr>
       <w:r>
@@ -52,6 +55,7 @@
     </w:p>
     <w:p>
       <w:pPr>
+        <w:spacing w:after="120"/>
         <w:jc w:val="center"/>
       </w:pPr>
       <w:r>
@@ -60,11 +64,12 @@
           <w:i w:val="0"/>
           <w:sz w:val="21"/>
         </w:rPr>
-        <w:t>Course: IT 110 - Web Systems and Technologies</w:t>
+        <w:t>IT 110 - Web Systems and Technologies</w:t>
       </w:r>
     </w:p>
     <w:p>
       <w:pPr>
+        <w:spacing w:after="120"/>
         <w:jc w:val="center"/>
       </w:pPr>
       <w:r>
@@ -78,6 +83,7 @@
     </w:p>
     <w:p>
       <w:pPr>
+        <w:spacing w:after="120"/>
         <w:jc w:val="center"/>
       </w:pPr>
       <w:r>
@@ -86,11 +92,12 @@
           <w:i w:val="0"/>
           <w:sz w:val="21"/>
         </w:rPr>
-        <w:t>Student / Group Member: andymarkcrasco</w:t>
+        <w:t>Student: Andy Mark L. Crasco  (GitHub: andymarkcrasco-blip)</w:t>
       </w:r>
     </w:p>
     <w:p>
       <w:pPr>
+        <w:spacing w:after="120"/>
         <w:jc w:val="center"/>
       </w:pPr>
       <w:r>
@@ -99,11 +106,12 @@
           <w:i w:val="0"/>
           <w:sz w:val="21"/>
         </w:rPr>
-        <w:t>Project: activity8 - Flutter Web (EventVenue Caraga)</w:t>
+        <w:t>Project: activity8 - Event Venue and Micro-Vendor Finder With Machine Learning-Based Sentiment Analytics in Caraga Region</w:t>
       </w:r>
     </w:p>
     <w:p>
       <w:pPr>
+        <w:spacing w:after="120"/>
         <w:jc w:val="center"/>
       </w:pPr>
       <w:r>
@@ -112,7 +120,7 @@
           <w:i w:val="0"/>
           <w:sz w:val="21"/>
         </w:rPr>
-        <w:t>Checkpoint date: October 2026</w:t>
+        <w:t>Date: October 2026</w:t>
       </w:r>
     </w:p>
     <w:p>
@@ -123,17 +131,160 @@
         <w:rPr>
           <w:color w:val="3F2780"/>
         </w:rPr>
-        <w:t>1. Activity 9 Summary</w:t>
+        <w:t>1. What we did</w:t>
       </w:r>
     </w:p>
     <w:p>
+      <w:pPr>
+        <w:spacing w:after="120"/>
+      </w:pPr>
       <w:r>
         <w:rPr>
           <w:b w:val="0"/>
           <w:i w:val="0"/>
           <w:sz w:val="21"/>
         </w:rPr>
-        <w:t>Activity 9 continues the same functioning Flutter Web project and GitHub repository created in Activity 8 - no new project was initialized. The Activity 8 Home, Login and Dashboard screens and the reusable widgets (app_button.dart, app_text_field.dart) were kept intact. On top of that baseline the group added lib/screens/report_form_screen.dart, a working Report Form for the EventVenue Caraga system where a client or vendor can report a venue listing issue, a booking problem, a payment concern or a suggestion. The form reuses the shared AppTextField and AppButton components (also used in login_screen.dart, home_screen.dart and dashboard_screen.dart) and adds field-level validation, a simulated asynchronous submit, and the four essential Flutter Web UI state responses: LOADING, SUCCESS, EMPTY and ERROR. All asynchronous responses are SIMULATED with Future.delayed because the REST API and PostgreSQL integration is planned for a later phase; the simulated failure is triggered from a clearly labeled 'Simulate API failure (demo only)' switch so the ERROR state and its Retry action can be reproduced live during the demonstration.</w:t>
+        <w:t>Activity 9 is a continuation, not a restart. We kept the Flutter Web project and the GitHub repository we built in Activity 8 and added to it. The Home, Login and Dashboard pages are still there and still work the way they did before, and the folder structure we set up in Activity 8 (screens, widgets, routes, services, models, constants) is exactly the same. What is new is lib/screens/report_form_screen.dart, a report form for our system where a client or a vendor can report a problem about a venue listing, a booking, a payment, or ask for a feature.</w:t>
+      </w:r>
+    </w:p>
+    <w:p>
+      <w:pPr>
+        <w:spacing w:after="120"/>
+      </w:pPr>
+      <w:r>
+        <w:rPr>
+          <w:b w:val="0"/>
+          <w:i w:val="0"/>
+          <w:sz w:val="21"/>
+        </w:rPr>
+        <w:t>The form has five inputs - report title, category, location, description, and an optional contact number - and it reuses the AppTextField and AppButton widgets we made in Activity 8 instead of writing new UI code. The category and location values are specific to our project: the locations are the places in the Caraga region (Butuan City, Surigao del Norte, Surigao del Sur, Agusan del Norte, Agusan del Sur, Dinagat Islands) and the categories are the kinds of problems a venue or vendor can run into.</w:t>
+      </w:r>
+    </w:p>
+    <w:p>
+      <w:pPr>
+        <w:spacing w:after="120"/>
+      </w:pPr>
+      <w:r>
+        <w:rPr>
+          <w:b w:val="0"/>
+          <w:i w:val="0"/>
+          <w:sz w:val="21"/>
+        </w:rPr>
+        <w:t>The part we spent the most time on was the four asynchronous responses the activity asks for. A report submission is not instant, so the screen had to show something while the request was running, something when it worked, something when there was nothing to show, and something when it failed. We wrote these as an enum in the screen itself, ReportUiState, with idle, loading, success, empty and error, and a separate AppStateView widget draws them so they all look like they belong to the same app.</w:t>
+      </w:r>
+    </w:p>
+    <w:p>
+      <w:pPr>
+        <w:spacing w:after="120"/>
+      </w:pPr>
+      <w:r>
+        <w:rPr>
+          <w:b w:val="0"/>
+          <w:i w:val="0"/>
+          <w:sz w:val="21"/>
+        </w:rPr>
+        <w:t>One thing we want to be clear about: the responses are simulated. We are not connected to a server yet, so the wait is a Future.delayed in lib/services/report_service.dart. We did not want that to be hidden, so there is a switch on the form labelled "Simulate API failure (demo only)" that we can turn on during the demonstration to show the error and retry behaviour on purpose. The message on the success screen also says that the response is simulated.</w:t>
+      </w:r>
+    </w:p>
+    <w:p>
+      <w:pPr>
+        <w:pStyle w:val="Heading2"/>
+      </w:pPr>
+      <w:r>
+        <w:rPr>
+          <w:color w:val="3F2780"/>
+        </w:rPr>
+        <w:t>Files we added and changed</w:t>
+      </w:r>
+    </w:p>
+    <w:p>
+      <w:pPr>
+        <w:pStyle w:val="ListBullet"/>
+        <w:spacing w:after="60"/>
+      </w:pPr>
+      <w:r>
+        <w:t>lib/screens/report_form_screen.dart - new. The form, the validation, and the four UI states.</w:t>
+      </w:r>
+    </w:p>
+    <w:p>
+      <w:pPr>
+        <w:pStyle w:val="ListBullet"/>
+        <w:spacing w:after="60"/>
+      </w:pPr>
+      <w:r>
+        <w:t>lib/widgets/app_state_view.dart - new. Draws the loading, success, empty and error responses.</w:t>
+      </w:r>
+    </w:p>
+    <w:p>
+      <w:pPr>
+        <w:pStyle w:val="ListBullet"/>
+        <w:spacing w:after="60"/>
+      </w:pPr>
+      <w:r>
+        <w:t>lib/services/report_service.dart - new. The simulated submit. It can also be told to fail.</w:t>
+      </w:r>
+    </w:p>
+    <w:p>
+      <w:pPr>
+        <w:pStyle w:val="ListBullet"/>
+        <w:spacing w:after="60"/>
+      </w:pPr>
+      <w:r>
+        <w:t>lib/models/report_model.dart - new. The report data object.</w:t>
+      </w:r>
+    </w:p>
+    <w:p>
+      <w:pPr>
+        <w:pStyle w:val="ListBullet"/>
+        <w:spacing w:after="60"/>
+      </w:pPr>
+      <w:r>
+        <w:t>lib/widgets/app_button.dart - we added an isLoading flag so the button can show a spinner and switch itself off while the request is running.</w:t>
+      </w:r>
+    </w:p>
+    <w:p>
+      <w:pPr>
+        <w:pStyle w:val="ListBullet"/>
+        <w:spacing w:after="60"/>
+      </w:pPr>
+      <w:r>
+        <w:t>lib/widgets/app_text_field.dart - we added maxLines, helperText and prefixIcon so the same field can be used for a single line and for the description box.</w:t>
+      </w:r>
+    </w:p>
+    <w:p>
+      <w:pPr>
+        <w:pStyle w:val="ListBullet"/>
+        <w:spacing w:after="60"/>
+      </w:pPr>
+      <w:r>
+        <w:t>lib/routes/app_routes.dart - we registered the /report route in the go_router setup we already had.</w:t>
+      </w:r>
+    </w:p>
+    <w:p>
+      <w:pPr>
+        <w:pStyle w:val="ListBullet"/>
+        <w:spacing w:after="60"/>
+      </w:pPr>
+      <w:r>
+        <w:t>lib/screens/home_screen.dart - we added a "Go to Report Form" button. The existing buttons are untouched.</w:t>
+      </w:r>
+    </w:p>
+    <w:p>
+      <w:pPr>
+        <w:pStyle w:val="ListBullet"/>
+        <w:spacing w:after="60"/>
+      </w:pPr>
+      <w:r>
+        <w:t>lib/widgets/app_shell.dart - we added Report to the navigation bar and the drawer.</w:t>
+      </w:r>
+    </w:p>
+    <w:p>
+      <w:pPr>
+        <w:pStyle w:val="ListBullet"/>
+        <w:spacing w:after="60"/>
+      </w:pPr>
+      <w:r>
+        <w:t>lib/constants/app_constants.dart - we moved the category and location lists here instead of keeping them inside the screen.</w:t>
       </w:r>
     </w:p>
     <w:p>
@@ -144,97 +295,59 @@
         <w:rPr>
           <w:color w:val="3F2780"/>
         </w:rPr>
-        <w:t>2. What Was Added to the Activity 8 Project</w:t>
+        <w:t>2. The four states and how we triggered them</w:t>
       </w:r>
     </w:p>
     <w:p>
       <w:pPr>
-        <w:pStyle w:val="ListBullet"/>
+        <w:spacing w:after="120"/>
       </w:pPr>
       <w:r>
-        <w:t>lib/screens/report_form_screen.dart (NEW) - form, validation, and the four async UI states.</w:t>
+        <w:rPr>
+          <w:b w:val="0"/>
+          <w:i w:val="0"/>
+          <w:sz w:val="21"/>
+        </w:rPr>
+        <w:t>Loading happens the moment the form is submitted with valid input. The submit button turns grey and shows a spinner, and the response area below the form says that the request is pending. The button is also disabled, which is what stops somebody from submitting the same report twice.</w:t>
       </w:r>
     </w:p>
     <w:p>
       <w:pPr>
-        <w:pStyle w:val="ListBullet"/>
+        <w:spacing w:after="120"/>
       </w:pPr>
       <w:r>
-        <w:t>lib/widgets/app_state_view.dart (NEW) - reusable renderer for LOADING / SUCCESS / EMPTY / ERROR.</w:t>
+        <w:rPr>
+          <w:b w:val="0"/>
+          <w:i w:val="0"/>
+          <w:sz w:val="21"/>
+        </w:rPr>
+        <w:t>Success is what the screen shows once the request finishes without failing. We get a green confirmation with the reference number of the report we just created, and there is a button that takes us back to a clean form.</w:t>
       </w:r>
     </w:p>
     <w:p>
       <w:pPr>
-        <w:pStyle w:val="ListBullet"/>
+        <w:spacing w:after="120"/>
       </w:pPr>
       <w:r>
-        <w:t>lib/services/report_service.dart (NEW) - simulated async submit, can simulate an HTTP 500 failure.</w:t>
+        <w:rPr>
+          <w:b w:val="0"/>
+          <w:i w:val="0"/>
+          <w:sz w:val="21"/>
+        </w:rPr>
+        <w:t>Empty is what we see when there is nothing to show. If we open the report screen before any report has been submitted, the response area says that there are no report records and the list underneath reads Submitted Reports (0). This is different from a validation error - validation is about one field being wrong, empty is about there being no data at all.</w:t>
       </w:r>
     </w:p>
     <w:p>
       <w:pPr>
-        <w:pStyle w:val="ListBullet"/>
+        <w:spacing w:after="120"/>
       </w:pPr>
-      <w:r>
-        <w:t>lib/models/report_model.dart (NEW) - report data object for the Caraga domain.</w:t>
-      </w:r>
-    </w:p>
-    <w:p>
-      <w:pPr>
-        <w:pStyle w:val="ListBullet"/>
-      </w:pPr>
-      <w:r>
-        <w:t>lib/widgets/app_button.dart (UPDATED) - added isLoading so the submit button is disabled while a request is pending.</w:t>
-      </w:r>
-    </w:p>
-    <w:p>
-      <w:pPr>
-        <w:pStyle w:val="ListBullet"/>
-      </w:pPr>
-      <w:r>
-        <w:t>lib/widgets/app_text_field.dart (UPDATED) - added maxLines, helperText and prefixIcon.</w:t>
-      </w:r>
-    </w:p>
-    <w:p>
-      <w:pPr>
-        <w:pStyle w:val="ListBullet"/>
-      </w:pPr>
-      <w:r>
-        <w:t>lib/routes/app_routes.dart (UPDATED) - registered the /report route in the existing navigation shell.</w:t>
-      </w:r>
-    </w:p>
-    <w:p>
-      <w:pPr>
-        <w:pStyle w:val="ListBullet"/>
-      </w:pPr>
-      <w:r>
-        <w:t>lib/screens/home_screen.dart (UPDATED) - added the 'Go to Report Form' button; existing navigation kept.</w:t>
-      </w:r>
-    </w:p>
-    <w:p>
-      <w:pPr>
-        <w:pStyle w:val="ListBullet"/>
-      </w:pPr>
-      <w:r>
-        <w:t>lib/widgets/app_shell.dart (UPDATED) - added 'Report' to the top nav bar and the drawer.</w:t>
-      </w:r>
-    </w:p>
-    <w:p>
-      <w:pPr>
-        <w:pStyle w:val="ListBullet"/>
-      </w:pPr>
-      <w:r>
-        <w:t>lib/constants/app_constants.dart (UPDATED) - report categories and Caraga locations.</w:t>
-      </w:r>
-    </w:p>
-    <w:p>
       <w:r>
         <w:rPr>
           <w:b w:val="0"/>
-          <w:i/>
+          <w:i w:val="0"/>
           <w:sz w:val="21"/>
         </w:rPr>
-        <w:t>The Activity 8 screens (Home, Login, Dashboard) were NOT replaced; the Report Form was added on top of the existing project and the same Git repository.</w:t>
+        <w:t>Error is triggered by turning on the simulate failure switch and submitting. The screen turns red, tells us the submission did not go through, and gives us a Retry button that runs the same submit again. We wanted the retry to actually work rather than just sit there, so the button calls the same function that the first submit used.</w:t>
       </w:r>
     </w:p>
     <w:p>
@@ -245,49 +358,46 @@
         <w:rPr>
           <w:color w:val="3F2780"/>
         </w:rPr>
-        <w:t>3. The Four Essential Async UI States</w:t>
+        <w:t>3. Problems we ran into while building it</w:t>
       </w:r>
     </w:p>
     <w:p>
       <w:pPr>
-        <w:pStyle w:val="ListBullet"/>
+        <w:spacing w:after="120"/>
       </w:pPr>
       <w:r>
-        <w:t>LOADING - triggered by submitting a valid form while the simulated request is pending: the Submit button is disabled and shows a spinner ('Submit Report...') and the response area shows 'LOADING - Submitting your report'.</w:t>
+        <w:rPr>
+          <w:b w:val="0"/>
+          <w:i w:val="0"/>
+          <w:sz w:val="21"/>
+        </w:rPr>
+        <w:t>The first issue was with the dropdown fields. At first we were using the label text to find them in our own tests, but the label changes once a value is chosen, so the tests could not find the field anymore. We changed the tests to target the dropdown by its position in the form instead, and after that the form tests passed.</w:t>
       </w:r>
     </w:p>
     <w:p>
       <w:pPr>
-        <w:pStyle w:val="ListBullet"/>
+        <w:spacing w:after="120"/>
       </w:pPr>
       <w:r>
-        <w:t>SUCCESS - triggered when the simulated request resolves without error: a green confirmation with the saved report reference number and a 'Submit another report' action.</w:t>
+        <w:rPr>
+          <w:b w:val="0"/>
+          <w:i w:val="0"/>
+          <w:sz w:val="21"/>
+        </w:rPr>
+        <w:t>The second issue was on the Git side. When we went to push Activity 9 we found the remote repository already had an earlier push from Activity 8 that only contained the starter files, and our two earlier commits had been made with a placeholder email address. We rewrote the author on those commits so that they show up under the right GitHub account, and then we pushed our branch as main and kept master in sync with it. We also had to point Git Credential Manager at our own account, because there was more than one GitHub account saved on the computer and it kept asking us which one to use.</w:t>
       </w:r>
     </w:p>
     <w:p>
       <w:pPr>
-        <w:pStyle w:val="ListBullet"/>
+        <w:spacing w:after="120"/>
       </w:pPr>
-      <w:r>
-        <w:t>EMPTY - triggered by opening the Report Form before any report record exists: 'EMPTY - No report records' with 'Submitted Reports (0)'. This is the no-data response, not a validation error.</w:t>
-      </w:r>
-    </w:p>
-    <w:p>
-      <w:pPr>
-        <w:pStyle w:val="ListBullet"/>
-      </w:pPr>
-      <w:r>
-        <w:t>ERROR - triggered by turning on 'Simulate API failure (demo only)' and submitting: a red explanation of the failure plus a working Retry button that re-submits the form.</w:t>
-      </w:r>
-    </w:p>
-    <w:p>
       <w:r>
         <w:rPr>
           <w:b w:val="0"/>
-          <w:i/>
+          <w:i w:val="0"/>
           <w:sz w:val="21"/>
         </w:rPr>
-        <w:t>Duplicate submissions are prevented: the submit action returns early while the state is LOADING and the shared AppButton is disabled with a spinner during that time.</w:t>
+        <w:t>The third issue was small but annoying: on a 1366x768 screen the response area was below the fold, so the loading and error messages were cut off in our screenshots. We scrolled the page before capturing so that the whole response box and the action button are visible in the evidence.</w:t>
       </w:r>
     </w:p>
     <w:p>
@@ -298,10 +408,13 @@
         <w:rPr>
           <w:color w:val="3F2780"/>
         </w:rPr>
-        <w:t>4. How to Run the Project</w:t>
+        <w:t>4. How we ran and tested it</w:t>
       </w:r>
     </w:p>
     <w:p>
+      <w:pPr>
+        <w:spacing w:after="160"/>
+      </w:pPr>
       <w:r>
         <w:rPr>
           <w:rFonts w:ascii="Consolas" w:hAnsi="Consolas"/>
@@ -315,13 +428,16 @@
       </w:r>
     </w:p>
     <w:p>
+      <w:pPr>
+        <w:spacing w:after="120"/>
+      </w:pPr>
       <w:r>
         <w:rPr>
           <w:b w:val="0"/>
           <w:i w:val="0"/>
           <w:sz w:val="21"/>
         </w:rPr>
-        <w:t>Verification: flutter analyze -&gt; No issues found; flutter test -&gt; 6 tests passed (Home shell, Home -&gt; Report Form navigation, EMPTY state, field-level validation, LOADING -&gt; SUCCESS, ERROR -&gt; Retry).</w:t>
+        <w:t>The app runs in Chrome on the Home, Login, Dashboard and Report screens. The demo login is student / 1234 and it is local only, there is no backend behind it yet. We also wrote automated tests for the important parts of the screen - that the home page still links to the report form, that the empty state appears when there are no records, that invalid input is rejected field by field, that a valid submission goes from loading to success, and that a failed submission shows the error with a working retry. All six tests pass and flutter analyze reports no issues.</w:t>
       </w:r>
     </w:p>
     <w:p>
@@ -332,27 +448,46 @@
         <w:rPr>
           <w:color w:val="3F2780"/>
         </w:rPr>
-        <w:t>5. Mandatory Screenshot Evidence</w:t>
+        <w:t>5. Screenshot evidence</w:t>
       </w:r>
     </w:p>
     <w:p>
+      <w:pPr>
+        <w:spacing w:after="120"/>
+      </w:pPr>
+      <w:r>
+        <w:rPr>
+          <w:b w:val="0"/>
+          <w:i w:val="0"/>
+          <w:sz w:val="21"/>
+        </w:rPr>
+        <w:t>The six required screenshots are below. We added one extra at the start showing the home page, because that is where the navigation into the report form happens.</w:t>
+      </w:r>
+    </w:p>
+    <w:p>
+      <w:pPr>
+        <w:spacing w:after="120"/>
+      </w:pPr>
       <w:r>
         <w:rPr>
           <w:b/>
           <w:i w:val="0"/>
           <w:sz w:val="21"/>
         </w:rPr>
-        <w:t>Screenshot 1 - Updated screen / widget structure</w:t>
+        <w:t>Screenshot 1 - the updated project structure</w:t>
       </w:r>
     </w:p>
     <w:p>
+      <w:pPr>
+        <w:spacing w:after="120"/>
+      </w:pPr>
       <w:r>
         <w:rPr>
           <w:b w:val="0"/>
           <w:i w:val="0"/>
           <w:sz w:val="21"/>
         </w:rPr>
-        <w:t>VS Code Explorer showing the Activity 8 folders (lib/screens, lib/widgets, lib/routes, lib/services, lib/models, lib/constants) together with the new lib/screens/report_form_screen.dart. The project name 'activity8' is visible in the Explorer and in the editor breadcrumb.</w:t>
+        <w:t>This is VS Code with the project open. On the left you can see the folders we set up in Activity 8, and under screens the new report_form_screen.dart sitting next to home, login and dashboard. The file is open on the right with the imports at the top, including the widgets we are reusing.</w:t>
       </w:r>
     </w:p>
     <w:p>
@@ -362,7 +497,7 @@
       <w:r>
         <w:drawing>
           <wp:inline xmlns:a="http://schemas.openxmlformats.org/drawingml/2006/main" xmlns:pic="http://schemas.openxmlformats.org/drawingml/2006/picture">
-            <wp:extent cx="6035040" cy="3214030"/>
+            <wp:extent cx="5943600" cy="3165333"/>
             <wp:docPr id="1" name="Picture 1"/>
             <wp:cNvGraphicFramePr>
               <a:graphicFrameLocks noChangeAspect="1"/>
@@ -383,7 +518,7 @@
                   <pic:spPr>
                     <a:xfrm>
                       <a:off x="0" y="0"/>
-                      <a:ext cx="6035040" cy="3214030"/>
+                      <a:ext cx="5943600" cy="3165333"/>
                     </a:xfrm>
                     <a:prstGeom prst="rect"/>
                   </pic:spPr>
@@ -396,6 +531,7 @@
     </w:p>
     <w:p>
       <w:pPr>
+        <w:spacing w:after="200"/>
         <w:jc w:val="center"/>
       </w:pPr>
       <w:r>
@@ -404,7 +540,7 @@
           <w:color w:val="444444"/>
           <w:sz w:val="18"/>
         </w:rPr>
-        <w:t>Screenshot 1 - VS Code Explorer with the Activity 8 structure and the new lib/screens/report_form_screen.dart</w:t>
+        <w:t>Screenshot 1 - VS Code Explorer showing the Activity 8 folders and the new report_form_screen.dart</w:t>
       </w:r>
     </w:p>
     <w:p>
@@ -413,23 +549,29 @@
       </w:r>
     </w:p>
     <w:p>
+      <w:pPr>
+        <w:spacing w:after="120"/>
+      </w:pPr>
       <w:r>
         <w:rPr>
           <w:b/>
           <w:i w:val="0"/>
           <w:sz w:val="21"/>
         </w:rPr>
-        <w:t>Screenshot 2 - Reusable widget used in two contexts</w:t>
+        <w:t>Screenshot 2 - the shared widget used in two different screens</w:t>
       </w:r>
     </w:p>
     <w:p>
+      <w:pPr>
+        <w:spacing w:after="120"/>
+      </w:pPr>
       <w:r>
         <w:rPr>
           <w:b w:val="0"/>
           <w:i w:val="0"/>
           <w:sz w:val="21"/>
         </w:rPr>
-        <w:t>The shared AppTextField from lib/widgets/ is visible in two different screens of the same project: on the left, report_form_screen.dart (line 200, the Description field), and on the right, the Activity 8 login_screen.dart (line 63, the Username field). AppButton is likewise shared by home_screen.dart, login_screen.dart, dashboard_screen.dart and report_form_screen.dart.</w:t>
+        <w:t>The activity asks us to show a widget from lib/widgets/ being used in the report form and in another screen. On the left is report_form_screen.dart at the Description field, and on the right is the Activity 8 login_screen.dart at the Username field. Both are the same AppTextField class from lib/widgets/app_text_field.dart. AppButton is shared the same way, and it is used in four screens: home, login, dashboard and the report form.</w:t>
       </w:r>
     </w:p>
     <w:p>
@@ -439,7 +581,7 @@
       <w:r>
         <w:drawing>
           <wp:inline xmlns:a="http://schemas.openxmlformats.org/drawingml/2006/main" xmlns:pic="http://schemas.openxmlformats.org/drawingml/2006/picture">
-            <wp:extent cx="6035040" cy="3214030"/>
+            <wp:extent cx="5943600" cy="3165333"/>
             <wp:docPr id="2" name="Picture 2"/>
             <wp:cNvGraphicFramePr>
               <a:graphicFrameLocks noChangeAspect="1"/>
@@ -460,7 +602,7 @@
                   <pic:spPr>
                     <a:xfrm>
                       <a:off x="0" y="0"/>
-                      <a:ext cx="6035040" cy="3214030"/>
+                      <a:ext cx="5943600" cy="3165333"/>
                     </a:xfrm>
                     <a:prstGeom prst="rect"/>
                   </pic:spPr>
@@ -473,6 +615,7 @@
     </w:p>
     <w:p>
       <w:pPr>
+        <w:spacing w:after="200"/>
         <w:jc w:val="center"/>
       </w:pPr>
       <w:r>
@@ -481,17 +624,20 @@
           <w:color w:val="444444"/>
           <w:sz w:val="18"/>
         </w:rPr>
-        <w:t>Screenshot 2a - AppTextField from lib/widgets/ used in report_form_screen.dart (left) and in login_screen.dart (right)</w:t>
+        <w:t>Screenshot 2a - AppTextField used in report_form_screen.dart (left) and login_screen.dart (right)</w:t>
       </w:r>
     </w:p>
     <w:p>
+      <w:pPr>
+        <w:spacing w:after="120"/>
+      </w:pPr>
       <w:r>
         <w:rPr>
           <w:b w:val="0"/>
           <w:i w:val="0"/>
           <w:sz w:val="21"/>
         </w:rPr>
-        <w:t>The same report_form_screen.dart running in Google Chrome, showing the real form fields built with the shared widgets (AppTextField and AppButton):</w:t>
+        <w:t>The same screen running in Chrome, so you can see the form as it actually looks with the fields and the shared buttons.</w:t>
       </w:r>
     </w:p>
     <w:p>
@@ -501,7 +647,7 @@
       <w:r>
         <w:drawing>
           <wp:inline xmlns:a="http://schemas.openxmlformats.org/drawingml/2006/main" xmlns:pic="http://schemas.openxmlformats.org/drawingml/2006/picture">
-            <wp:extent cx="6035040" cy="3008579"/>
+            <wp:extent cx="5943600" cy="2962995"/>
             <wp:docPr id="3" name="Picture 3"/>
             <wp:cNvGraphicFramePr>
               <a:graphicFrameLocks noChangeAspect="1"/>
@@ -522,7 +668,7 @@
                   <pic:spPr>
                     <a:xfrm>
                       <a:off x="0" y="0"/>
-                      <a:ext cx="6035040" cy="3008579"/>
+                      <a:ext cx="5943600" cy="2962995"/>
                     </a:xfrm>
                     <a:prstGeom prst="rect"/>
                   </pic:spPr>
@@ -535,6 +681,7 @@
     </w:p>
     <w:p>
       <w:pPr>
+        <w:spacing w:after="200"/>
         <w:jc w:val="center"/>
       </w:pPr>
       <w:r>
@@ -552,23 +699,29 @@
       </w:r>
     </w:p>
     <w:p>
+      <w:pPr>
+        <w:spacing w:after="120"/>
+      </w:pPr>
       <w:r>
         <w:rPr>
           <w:b/>
           <w:i w:val="0"/>
           <w:sz w:val="21"/>
         </w:rPr>
-        <w:t>Screenshot 3 - LOADING state</w:t>
+        <w:t>Screenshot 3 - loading</w:t>
       </w:r>
     </w:p>
     <w:p>
+      <w:pPr>
+        <w:spacing w:after="120"/>
+      </w:pPr>
       <w:r>
         <w:rPr>
           <w:b w:val="0"/>
           <w:i w:val="0"/>
           <w:sz w:val="21"/>
         </w:rPr>
-        <w:t>Trigger: the user filled in a valid report (title, category, location, description, contact) and pressed 'Submit Report'. The simulated asynchronous request is still pending, so the submit button is disabled with a spinner and the response area shows the LOADING message. This also proves that duplicate submission is prevented while the request is running.</w:t>
+        <w:t>We filled in the form with a valid report - a beach resort venue in Butuan City that closed early on the event date - and pressed Submit Report. This was captured while the request was still pending. The button is disabled and spinning, and the response area shows the loading message.</w:t>
       </w:r>
     </w:p>
     <w:p>
@@ -578,7 +731,7 @@
       <w:r>
         <w:drawing>
           <wp:inline xmlns:a="http://schemas.openxmlformats.org/drawingml/2006/main" xmlns:pic="http://schemas.openxmlformats.org/drawingml/2006/picture">
-            <wp:extent cx="6035040" cy="3008579"/>
+            <wp:extent cx="5943600" cy="2962995"/>
             <wp:docPr id="4" name="Picture 4"/>
             <wp:cNvGraphicFramePr>
               <a:graphicFrameLocks noChangeAspect="1"/>
@@ -599,7 +752,7 @@
                   <pic:spPr>
                     <a:xfrm>
                       <a:off x="0" y="0"/>
-                      <a:ext cx="6035040" cy="3008579"/>
+                      <a:ext cx="5943600" cy="2962995"/>
                     </a:xfrm>
                     <a:prstGeom prst="rect"/>
                   </pic:spPr>
@@ -612,6 +765,7 @@
     </w:p>
     <w:p>
       <w:pPr>
+        <w:spacing w:after="200"/>
         <w:jc w:val="center"/>
       </w:pPr>
       <w:r>
@@ -620,7 +774,7 @@
           <w:color w:val="444444"/>
           <w:sz w:val="18"/>
         </w:rPr>
-        <w:t>Screenshot 3 - LOADING: button disabled with spinner, 'LOADING - Submitting your report'</w:t>
+        <w:t>Screenshot 3 - Loading state, with the submit button disabled so the report cannot be sent twice</w:t>
       </w:r>
     </w:p>
     <w:p>
@@ -629,23 +783,29 @@
       </w:r>
     </w:p>
     <w:p>
+      <w:pPr>
+        <w:spacing w:after="120"/>
+      </w:pPr>
       <w:r>
         <w:rPr>
           <w:b/>
           <w:i w:val="0"/>
           <w:sz w:val="21"/>
         </w:rPr>
-        <w:t>Screenshot 4 - SUCCESS state</w:t>
+        <w:t>Screenshot 4 - success</w:t>
       </w:r>
     </w:p>
     <w:p>
+      <w:pPr>
+        <w:spacing w:after="120"/>
+      </w:pPr>
       <w:r>
         <w:rPr>
           <w:b w:val="0"/>
           <w:i w:val="0"/>
           <w:sz w:val="21"/>
         </w:rPr>
-        <w:t>Trigger: the simulated request completed successfully (about 3 seconds after the press). The response area turns green with 'SUCCESS - Report submitted' and the saved reference number, and the submitted report now appears in the 'Submitted Reports' list below.</w:t>
+        <w:t>A few seconds later the simulated request finished without failing. The response turned green and shows the reference number of the report that was created, with a button to submit another one. The form fields were cleared, which is why they are empty again in this screenshot.</w:t>
       </w:r>
     </w:p>
     <w:p>
@@ -655,7 +815,7 @@
       <w:r>
         <w:drawing>
           <wp:inline xmlns:a="http://schemas.openxmlformats.org/drawingml/2006/main" xmlns:pic="http://schemas.openxmlformats.org/drawingml/2006/picture">
-            <wp:extent cx="6035040" cy="3008579"/>
+            <wp:extent cx="5943600" cy="2962995"/>
             <wp:docPr id="5" name="Picture 5"/>
             <wp:cNvGraphicFramePr>
               <a:graphicFrameLocks noChangeAspect="1"/>
@@ -676,7 +836,7 @@
                   <pic:spPr>
                     <a:xfrm>
                       <a:off x="0" y="0"/>
-                      <a:ext cx="6035040" cy="3008579"/>
+                      <a:ext cx="5943600" cy="2962995"/>
                     </a:xfrm>
                     <a:prstGeom prst="rect"/>
                   </pic:spPr>
@@ -689,6 +849,7 @@
     </w:p>
     <w:p>
       <w:pPr>
+        <w:spacing w:after="200"/>
         <w:jc w:val="center"/>
       </w:pPr>
       <w:r>
@@ -697,7 +858,7 @@
           <w:color w:val="444444"/>
           <w:sz w:val="18"/>
         </w:rPr>
-        <w:t>Screenshot 4 - SUCCESS: 'Report EV-481387 saved successfully (simulated response)' with a 'Submit another report' action</w:t>
+        <w:t>Screenshot 4 - Success state with the saved report reference number</w:t>
       </w:r>
     </w:p>
     <w:p>
@@ -706,23 +867,29 @@
       </w:r>
     </w:p>
     <w:p>
+      <w:pPr>
+        <w:spacing w:after="120"/>
+      </w:pPr>
       <w:r>
         <w:rPr>
           <w:b/>
           <w:i w:val="0"/>
           <w:sz w:val="21"/>
         </w:rPr>
-        <w:t>Screenshot 5 - EMPTY state</w:t>
+        <w:t>Screenshot 5 - empty</w:t>
       </w:r>
     </w:p>
     <w:p>
+      <w:pPr>
+        <w:spacing w:after="120"/>
+      </w:pPr>
       <w:r>
         <w:rPr>
           <w:b w:val="0"/>
           <w:i w:val="0"/>
           <w:sz w:val="21"/>
         </w:rPr>
-        <w:t>Trigger: the Report Form was opened before any report record existed. The response area shows 'EMPTY - No report records' and the list below shows 'Submitted Reports (0)'. This is the no-data response and is different from a validation error.</w:t>
+        <w:t>This was taken before anything was submitted, so the response area says there are no report records and the list below shows Submitted Reports (0). This is the no-data response, not a validation error.</w:t>
       </w:r>
     </w:p>
     <w:p>
@@ -732,7 +899,7 @@
       <w:r>
         <w:drawing>
           <wp:inline xmlns:a="http://schemas.openxmlformats.org/drawingml/2006/main" xmlns:pic="http://schemas.openxmlformats.org/drawingml/2006/picture">
-            <wp:extent cx="6035040" cy="3008579"/>
+            <wp:extent cx="5943600" cy="2962995"/>
             <wp:docPr id="6" name="Picture 6"/>
             <wp:cNvGraphicFramePr>
               <a:graphicFrameLocks noChangeAspect="1"/>
@@ -753,7 +920,7 @@
                   <pic:spPr>
                     <a:xfrm>
                       <a:off x="0" y="0"/>
-                      <a:ext cx="6035040" cy="3008579"/>
+                      <a:ext cx="5943600" cy="2962995"/>
                     </a:xfrm>
                     <a:prstGeom prst="rect"/>
                   </pic:spPr>
@@ -766,6 +933,7 @@
     </w:p>
     <w:p>
       <w:pPr>
+        <w:spacing w:after="200"/>
         <w:jc w:val="center"/>
       </w:pPr>
       <w:r>
@@ -774,7 +942,7 @@
           <w:color w:val="444444"/>
           <w:sz w:val="18"/>
         </w:rPr>
-        <w:t>Screenshot 5 - EMPTY: 'EMPTY - No report records' and 'Submitted Reports (0)'</w:t>
+        <w:t>Screenshot 5 - Empty state, no report records to display yet</w:t>
       </w:r>
     </w:p>
     <w:p>
@@ -783,23 +951,29 @@
       </w:r>
     </w:p>
     <w:p>
+      <w:pPr>
+        <w:spacing w:after="120"/>
+      </w:pPr>
       <w:r>
         <w:rPr>
           <w:b/>
           <w:i w:val="0"/>
           <w:sz w:val="21"/>
         </w:rPr>
-        <w:t>Screenshot 6 - ERROR state</w:t>
+        <w:t>Screenshot 6 - error</w:t>
       </w:r>
     </w:p>
     <w:p>
+      <w:pPr>
+        <w:spacing w:after="120"/>
+      </w:pPr>
       <w:r>
         <w:rPr>
           <w:b w:val="0"/>
           <w:i w:val="0"/>
           <w:sz w:val="21"/>
         </w:rPr>
-        <w:t>Trigger: the user turned on the 'Simulate API failure (demo only)' switch and submitted a valid report. The simulated request failed, so the response area turned red with 'ERROR - Report was not submitted' and the reason. A visible Retry button is provided and re-runs the submission.</w:t>
+        <w:t>We turned on the simulate failure switch and submitted again. The screen went red and explained that the report was not submitted, and the Retry button is right there underneath. The report we created successfully earlier is still in the list below, so we can see the successful and failed submissions side by side.</w:t>
       </w:r>
     </w:p>
     <w:p>
@@ -809,7 +983,7 @@
       <w:r>
         <w:drawing>
           <wp:inline xmlns:a="http://schemas.openxmlformats.org/drawingml/2006/main" xmlns:pic="http://schemas.openxmlformats.org/drawingml/2006/picture">
-            <wp:extent cx="6035040" cy="3008579"/>
+            <wp:extent cx="5943600" cy="2962995"/>
             <wp:docPr id="7" name="Picture 7"/>
             <wp:cNvGraphicFramePr>
               <a:graphicFrameLocks noChangeAspect="1"/>
@@ -830,7 +1004,7 @@
                   <pic:spPr>
                     <a:xfrm>
                       <a:off x="0" y="0"/>
-                      <a:ext cx="6035040" cy="3008579"/>
+                      <a:ext cx="5943600" cy="2962995"/>
                     </a:xfrm>
                     <a:prstGeom prst="rect"/>
                   </pic:spPr>
@@ -843,6 +1017,7 @@
     </w:p>
     <w:p>
       <w:pPr>
+        <w:spacing w:after="200"/>
         <w:jc w:val="center"/>
       </w:pPr>
       <w:r>
@@ -851,7 +1026,7 @@
           <w:color w:val="444444"/>
           <w:sz w:val="18"/>
         </w:rPr>
-        <w:t>Screenshot 6 - ERROR: failure explanation with the visible Retry action</w:t>
+        <w:t>Screenshot 6 - Error state with the visible Retry action</w:t>
       </w:r>
     </w:p>
     <w:p>
@@ -867,7 +1042,7 @@
         <w:rPr>
           <w:color w:val="3F2780"/>
         </w:rPr>
-        <w:t>6. Functional Verification Checklist</w:t>
+        <w:t>6. Verification checklist</w:t>
       </w:r>
     </w:p>
     <w:tbl>
@@ -897,7 +1072,7 @@
           </w:tcPr>
           <w:p>
             <w:r>
-              <w:t>Observed outcome / evidence</w:t>
+              <w:t>What we observed</w:t>
             </w:r>
           </w:p>
         </w:tc>
@@ -909,7 +1084,7 @@
           </w:tcPr>
           <w:p>
             <w:r>
-              <w:t>Home -&gt; Report Form navigation</w:t>
+              <w:t>Home to Report Form navigation</w:t>
             </w:r>
           </w:p>
         </w:tc>
@@ -919,7 +1094,7 @@
           </w:tcPr>
           <w:p>
             <w:r>
-              <w:t>Pass - the 'Go to Report Form' button on the Home screen and the 'Report' button in the navigation shell both open the Report Form (Screenshot 2b, Screenshot 1).</w:t>
+              <w:t>Works. The button on the home page and the Report button in the navigation bar both open the form (Screenshots 1 and 2b).</w:t>
             </w:r>
           </w:p>
         </w:tc>
@@ -931,7 +1106,7 @@
           </w:tcPr>
           <w:p>
             <w:r>
-              <w:t>Invalid form produces field-level validation</w:t>
+              <w:t>Invalid form is rejected</w:t>
             </w:r>
           </w:p>
         </w:tc>
@@ -941,7 +1116,7 @@
           </w:tcPr>
           <w:p>
             <w:r>
-              <w:t>Pass - empty title shows 'Report title is required', empty category 'Please choose a category', empty location 'Please choose a location', empty description 'Description is required'. Covered by flutter test ('Invalid input triggers field-level validation').</w:t>
+              <w:t>Works. Empty title gives "Report title is required", empty category "Please choose a category", empty location "Please choose a location", empty description "Description is required". Covered by an automated test.</w:t>
             </w:r>
           </w:p>
         </w:tc>
@@ -953,7 +1128,7 @@
           </w:tcPr>
           <w:p>
             <w:r>
-              <w:t>Valid submit -&gt; Loading -&gt; Success</w:t>
+              <w:t>Valid submit goes loading then success</w:t>
             </w:r>
           </w:p>
         </w:tc>
@@ -963,7 +1138,7 @@
           </w:tcPr>
           <w:p>
             <w:r>
-              <w:t>Pass - Screenshot 3 (LOADING) then Screenshot 4 (SUCCESS). Covered by flutter test ('Valid submit goes LOADING then SUCCESS').</w:t>
+              <w:t>Works, Screenshots 3 and 4. Covered by an automated test.</w:t>
             </w:r>
           </w:p>
         </w:tc>
@@ -975,7 +1150,7 @@
           </w:tcPr>
           <w:p>
             <w:r>
-              <w:t>No available report records -&gt; Empty</w:t>
+              <w:t>No records gives the empty response</w:t>
             </w:r>
           </w:p>
         </w:tc>
@@ -985,7 +1160,7 @@
           </w:tcPr>
           <w:p>
             <w:r>
-              <w:t>Pass - Screenshot 5 shows 'EMPTY - No report records' with 'Submitted Reports (0)'.</w:t>
+              <w:t>Works, Screenshot 5. Covered by an automated test.</w:t>
             </w:r>
           </w:p>
         </w:tc>
@@ -997,7 +1172,7 @@
           </w:tcPr>
           <w:p>
             <w:r>
-              <w:t>Simulated failure -&gt; Error -&gt; Retry</w:t>
+              <w:t>Failure gives error and retry</w:t>
             </w:r>
           </w:p>
         </w:tc>
@@ -1007,7 +1182,7 @@
           </w:tcPr>
           <w:p>
             <w:r>
-              <w:t>Pass - Screenshot 6 shows the ERROR explanation and the Retry button, which re-submits the form. Covered by flutter test ('Simulated failure shows ERROR with a Retry action').</w:t>
+              <w:t>Works, Screenshot 6. The retry button runs the submit again. Covered by an automated test.</w:t>
             </w:r>
           </w:p>
         </w:tc>
@@ -1019,7 +1194,7 @@
           </w:tcPr>
           <w:p>
             <w:r>
-              <w:t>Shared button or field widget used in two contexts</w:t>
+              <w:t>Shared widget used in two places</w:t>
             </w:r>
           </w:p>
         </w:tc>
@@ -1029,7 +1204,7 @@
           </w:tcPr>
           <w:p>
             <w:r>
-              <w:t>Pass - AppTextField is used in report_form_screen.dart (line 200) and in login_screen.dart (line 63) in the same project (Screenshot 2a). AppButton is used in 4 screens.</w:t>
+              <w:t>AppTextField appears in report_form_screen.dart and login_screen.dart, shown side by side in Screenshot 2a. AppButton is used in four screens.</w:t>
             </w:r>
           </w:p>
         </w:tc>
@@ -1043,20 +1218,26 @@
         <w:rPr>
           <w:color w:val="3F2780"/>
         </w:rPr>
-        <w:t>7. GitHub Checkpoints</w:t>
+        <w:t>7. Repository and checkpoints</w:t>
       </w:r>
     </w:p>
     <w:p>
+      <w:pPr>
+        <w:spacing w:after="120"/>
+      </w:pPr>
       <w:r>
         <w:rPr>
           <w:b w:val="0"/>
           <w:i w:val="0"/>
           <w:sz w:val="21"/>
         </w:rPr>
-        <w:t>The same repository and branch from Activity 8 was used. Activity 9 is the second checkpoint.</w:t>
+        <w:t>We used the same repository and the same branch as Activity 8, so Activity 9 is simply the next commit in the history rather than a new project.</w:t>
       </w:r>
     </w:p>
     <w:p>
+      <w:pPr>
+        <w:spacing w:after="160"/>
+      </w:pPr>
       <w:r>
         <w:rPr>
           <w:rFonts w:ascii="Consolas" w:hAnsi="Consolas"/>
@@ -1072,43 +1253,39 @@
       </w:r>
     </w:p>
     <w:p>
+      <w:pPr>
+        <w:pStyle w:val="ListBullet"/>
+        <w:spacing w:after="60"/>
+      </w:pPr>
       <w:r>
-        <w:rPr>
-          <w:b w:val="0"/>
-          <w:i w:val="0"/>
-          <w:sz w:val="21"/>
-        </w:rPr>
-        <w:t>Checkpoint 1 (Activity 8): c7497c3 - Initial Flutter Web project - home/login/navigation shell</w:t>
+        <w:t>Repository: https://github.com/andymarkcrasco-blip/activity8</w:t>
       </w:r>
     </w:p>
     <w:p>
+      <w:pPr>
+        <w:pStyle w:val="ListBullet"/>
+        <w:spacing w:after="60"/>
+      </w:pPr>
       <w:r>
-        <w:rPr>
-          <w:b w:val="0"/>
-          <w:i w:val="0"/>
-          <w:sz w:val="21"/>
-        </w:rPr>
-        <w:t>Checkpoint 2 (Activity 9): 1a14bf0 - Update group member to andymarkcrasco</w:t>
+        <w:t>c7497c3 - Initial Flutter Web project - home/login/navigation shell  (Activity 8)</w:t>
       </w:r>
     </w:p>
     <w:p>
+      <w:pPr>
+        <w:pStyle w:val="ListBullet"/>
+        <w:spacing w:after="60"/>
+      </w:pPr>
       <w:r>
-        <w:rPr>
-          <w:b w:val="0"/>
-          <w:i w:val="0"/>
-          <w:sz w:val="21"/>
-        </w:rPr>
-        <w:t>Checkpoint 3 (Activity 9): 1ef6ac3 - Add report form and Flutter UI states</w:t>
+        <w:t>1ef6ac3 - Add report form and Flutter UI states  (Activity 9)</w:t>
       </w:r>
     </w:p>
     <w:p>
+      <w:pPr>
+        <w:pStyle w:val="ListBullet"/>
+        <w:spacing w:after="60"/>
+      </w:pPr>
       <w:r>
-        <w:rPr>
-          <w:b/>
-          <w:i w:val="0"/>
-          <w:sz w:val="21"/>
-        </w:rPr>
-        <w:t>GitHub repository link: https://github.com/andymarkcrasco-blip/activity8</w:t>
+        <w:t>00af0f8 - Post-laboratory reflection answers to evidence report  (Activity 9)</w:t>
       </w:r>
     </w:p>
     <w:p>
@@ -1119,39 +1296,33 @@
         <w:rPr>
           <w:color w:val="3F2780"/>
         </w:rPr>
-        <w:t>8. Notes and Limitations</w:t>
+        <w:t>8. Limits of what we have done</w:t>
       </w:r>
     </w:p>
     <w:p>
       <w:pPr>
-        <w:pStyle w:val="ListBullet"/>
+        <w:spacing w:after="120"/>
       </w:pPr>
       <w:r>
-        <w:t>The four UI states are SIMULATED. The asynchronous delay is produced by Future.delayed in lib/services/report_service.dart because the REST API (instructor-approved backend, e.g. FastAPI) and the PostgreSQL database (IT 108) are not connected yet.</w:t>
+        <w:rPr>
+          <w:b w:val="0"/>
+          <w:i w:val="0"/>
+          <w:sz w:val="21"/>
+        </w:rPr>
+        <w:t>We want to be honest about where the project stands. There is no server behind this yet, so nothing we submit is really stored anywhere - the reports live in memory for as long as the app is running. Every one of the four states is simulated, including the error, and the switch on the form makes that explicit rather than hiding it. The REST API (an instructor-approved backend such as FastAPI) and the PostgreSQL database from IT 108 are still only planned.</w:t>
       </w:r>
     </w:p>
     <w:p>
       <w:pPr>
-        <w:pStyle w:val="ListBullet"/>
+        <w:spacing w:after="120"/>
       </w:pPr>
       <w:r>
-        <w:t>The ERROR state is reproduced on purpose with the 'Simulate API failure (demo only)' switch; the switch is clearly labeled so the response is not mistaken for a real crash.</w:t>
-      </w:r>
-    </w:p>
-    <w:p>
-      <w:pPr>
-        <w:pStyle w:val="ListBullet"/>
-      </w:pPr>
-      <w:r>
-        <w:t>When the real API is connected, only report_service.dart has to change: replace the Future.delayed block with an http.post call, map the JSON into ReportModel, and the four states keep working because they are driven by the same ReportUiState enum.</w:t>
-      </w:r>
-    </w:p>
-    <w:p>
-      <w:pPr>
-        <w:pStyle w:val="ListBullet"/>
-      </w:pPr>
-      <w:r>
-        <w:t>No report record is actually saved in a database in this activity - the saved list is kept in memory for the running session.</w:t>
+        <w:rPr>
+          <w:b w:val="0"/>
+          <w:i w:val="0"/>
+          <w:sz w:val="21"/>
+        </w:rPr>
+        <w:t>When we connect them, the change is mostly in one file. The Future.delayed inside report_service.dart becomes an http.post to the endpoint, the JSON that comes back is mapped into ReportModel, and the screen asks the API for the list of reports so that the empty state comes from a real query. The enum and the four builders in report_form_screen.dart do not have to change at all, which is the reason we kept the state handling separate from the form in the first place.</w:t>
       </w:r>
     </w:p>
     <w:p>
@@ -1162,107 +1333,137 @@
         <w:rPr>
           <w:color w:val="3F2780"/>
         </w:rPr>
-        <w:t>9. Post-Laboratory Reflection</w:t>
+        <w:t>9. Post-laboratory reflection</w:t>
       </w:r>
     </w:p>
     <w:p>
+      <w:pPr>
+        <w:spacing w:after="120"/>
+      </w:pPr>
       <w:r>
         <w:rPr>
           <w:b w:val="0"/>
           <w:i w:val="0"/>
           <w:sz w:val="21"/>
         </w:rPr>
-        <w:t>1. How does report_form_screen.dart extend your Activity 8 project without replacing its existing Home and Login screens?</w:t>
+        <w:t>1. How does report_form_screen.dart extend the Activity 8 project without replacing the Home and Login screens?</w:t>
       </w:r>
     </w:p>
     <w:p>
+      <w:pPr>
+        <w:spacing w:after="120"/>
+      </w:pPr>
       <w:r>
         <w:rPr>
           <w:b w:val="0"/>
           <w:i w:val="0"/>
           <w:sz w:val="21"/>
         </w:rPr>
-        <w:t>report_form_screen.dart was added as a new file under lib/screens/ and registered as a new '/report' route in the existing go_router configuration (lib/routes/app_routes.dart). The Activity 8 Home, Login and Dashboard screens were only given an extra navigation button; their original code and behavior were not replaced. The folder structure from Activity 8 (screens, widgets, routes, services, models, constants) is preserved, so the new screen simply reuses the same shared components instead of duplicating interface code.</w:t>
+        <w:t>It sits alongside them instead of taking their place. We created it as a new file in lib/screens/ and registered a new /report route in the go_router configuration that Activity 8 already had. The Home and Login screens were only given one extra button each so we could reach the form; we did not rewrite their logic or their layout. Because the structure from Activity 8 is still in place, the new screen was able to reuse the shared widgets straight away instead of duplicating them.</w:t>
       </w:r>
     </w:p>
     <w:p>
+      <w:pPr>
+        <w:spacing w:after="120"/>
+      </w:pPr>
       <w:r>
         <w:rPr>
           <w:b w:val="0"/>
           <w:i w:val="0"/>
           <w:sz w:val="21"/>
         </w:rPr>
-        <w:t>2. Which shared widget did your group reuse, and what benefit does that provide?</w:t>
+        <w:t>2. Which shared widget did we reuse, and what benefit does it give us?</w:t>
       </w:r>
     </w:p>
     <w:p>
+      <w:pPr>
+        <w:spacing w:after="120"/>
+      </w:pPr>
       <w:r>
         <w:rPr>
           <w:b w:val="0"/>
           <w:i w:val="0"/>
           <w:sz w:val="21"/>
         </w:rPr>
-        <w:t>The group reused AppTextField from lib/widgets/app_text_field.dart in two different screens - the Description field of report_form_screen.dart (line 200) and the Username field of login_screen.dart (line 63) - and AppButton in four screens (home, login, dashboard and report form). The benefit is the 'build once, reuse many times' principle: the label style, borders, validation hooks and button behavior stay consistent across the whole application, any change to the component automatically updates every screen that uses it, there is much less duplicated code, and each team member can work on a different layer without conflicting edits.</w:t>
+        <w:t>We reused AppTextField, in the report form and in the login screen, and AppButton, which is used in four screens. The benefit is that we only build it once. The label style, the border, the validation hook and the disabled-while-loading behaviour are all defined in one place, so when we change the look of the field every screen changes with it. It also keeps the code smaller and means two of us can work on different screens at the same time without stepping on each other's files.</w:t>
       </w:r>
     </w:p>
     <w:p>
+      <w:pPr>
+        <w:spacing w:after="120"/>
+      </w:pPr>
       <w:r>
         <w:rPr>
           <w:b w:val="0"/>
           <w:i w:val="0"/>
           <w:sz w:val="21"/>
         </w:rPr>
-        <w:t>3. How does your report form prevent invalid input and duplicate submissions?</w:t>
+        <w:t>3. How does the form prevent invalid input and duplicate submissions?</w:t>
       </w:r>
     </w:p>
     <w:p>
+      <w:pPr>
+        <w:spacing w:after="120"/>
+      </w:pPr>
       <w:r>
         <w:rPr>
           <w:b w:val="0"/>
           <w:i w:val="0"/>
           <w:sz w:val="21"/>
         </w:rPr>
-        <w:t>Invalid input is prevented by a GlobalKey&lt;FormState&gt; and per-field validators: the report title needs at least 5 characters, the description at least 10 characters, the category and the location are required dropdowns, and an optional contact number must be at least 7 digits. Duplicate submission is prevented in two ways: the submitReport() method returns immediately while the state is LOADING, and the shared AppButton is given isLoading: true so it is rendered disabled with a spinner while the simulated request is still pending.</w:t>
+        <w:t>For invalid input we use a GlobalKey&lt;FormState&gt; with a validator on each field. The title needs at least five characters, the description at least ten, the category and location have to be chosen from the dropdowns, and a contact number, if given, needs at least seven digits. For duplicate submissions we check the state at the start of submitReport and return immediately if it is still loading, and on top of that the shared AppButton is given isLoading so it is drawn disabled with a spinner while the request is running.</w:t>
       </w:r>
     </w:p>
     <w:p>
+      <w:pPr>
+        <w:spacing w:after="120"/>
+      </w:pPr>
       <w:r>
         <w:rPr>
           <w:b w:val="0"/>
           <w:i w:val="0"/>
           <w:sz w:val="21"/>
         </w:rPr>
-        <w:t>4. How did you reproduce the Loading, Success, Empty, and Error responses? Which were simulated?</w:t>
+        <w:t>4. How did we reproduce the loading, success, empty and error responses, and which of them are simulated?</w:t>
       </w:r>
     </w:p>
     <w:p>
+      <w:pPr>
+        <w:spacing w:after="120"/>
+      </w:pPr>
       <w:r>
         <w:rPr>
           <w:b w:val="0"/>
           <w:i w:val="0"/>
           <w:sz w:val="21"/>
         </w:rPr>
-        <w:t>LOADING was reproduced by submitting a valid form and capturing the screen while the asynchronous request was still pending (the button was disabled with a spinner). SUCCESS was reproduced by letting the request finish without an error, which returned the green confirmation with the report reference number. EMPTY was reproduced by opening the Report Form before any report record existed, showing the 'EMPTY - No report records' response and 'Submitted Reports (0)'. ERROR was reproduced by turning on the 'Simulate API failure (demo only)' switch and submitting, which produced the red failure explanation and the Retry button. ALL FOUR responses are currently SIMULATED using Future.delayed, because the REST API and the PostgreSQL database are not connected yet.</w:t>
+        <w:t>All four are simulated at the moment. Loading was captured while the delayed request was still pending. Success was captured after it finished without failing. Empty was captured by opening the form before anything had been submitted. Error was captured by turning on the simulate failure switch, which makes the service throw the way a real server error would. The point of the switch is that when the class is demonstrated we can show the error on purpose instead of waiting for something to break.</w:t>
       </w:r>
     </w:p>
     <w:p>
+      <w:pPr>
+        <w:spacing w:after="120"/>
+      </w:pPr>
       <w:r>
         <w:rPr>
           <w:b w:val="0"/>
           <w:i w:val="0"/>
           <w:sz w:val="21"/>
         </w:rPr>
-        <w:t>5. What must be changed when the real REST API and PostgreSQL database are connected later?</w:t>
+        <w:t>5. What has to change when the real REST API and PostgreSQL database are connected?</w:t>
       </w:r>
     </w:p>
     <w:p>
+      <w:pPr>
+        <w:spacing w:after="120"/>
+      </w:pPr>
       <w:r>
         <w:rPr>
           <w:b w:val="0"/>
           <w:i w:val="0"/>
           <w:sz w:val="21"/>
         </w:rPr>
-        <w:t>Only lib/services/report_service.dart has to change: the Future.delayed block is replaced with an http.post call to the instructor-approved REST API (e.g. FastAPI), the JSON response is mapped into the ReportModel, and the screen loads the report list from the API so that the EMPTY state is produced by a real query instead of an empty in-memory list. The ReportUiState enum, the AppStateView widget and all four state builders in report_form_screen.dart stay exactly the same, so the LOADING, SUCCESS, EMPTY and ERROR responses keep working with real data; the 'Simulate API failure' switch can then be removed because genuine server errors will be handled by the same catch block.</w:t>
+        <w:t>Only lib/services/report_service.dart. The delayed wait is replaced with an http.post call to the backend, the response is mapped into ReportModel, and the screen loads the report list from the API so that the empty state is based on a real query. Everything in report_form_screen.dart stays as it is, including the enum and the four response builders, so the four states carry over to the real backend without any rework.</w:t>
       </w:r>
     </w:p>
     <w:sectPr>

</xml_diff>